<commit_message>
Add Al Oraiman Perfumes to portfolio and CV
</commit_message>
<xml_diff>
--- a/Ahmed_Beshir_Resume.docx
+++ b/Ahmed_Beshir_Resume.docx
@@ -74,7 +74,7 @@
         </w:rPr>
         <w:t xml:space="preserve">   |   </w:t>
       </w:r>
-      <w:hyperlink w:history="1" r:id="rIdmx6wmr7-j7pcsavbv9ol3">
+      <w:hyperlink w:history="1" r:id="rIdfjtam47srgggq5phf5wln">
         <w:r>
           <w:rPr>
             <w:color w:val="2E75B6"/>
@@ -92,7 +92,7 @@
         </w:rPr>
         <w:t xml:space="preserve">   |   </w:t>
       </w:r>
-      <w:hyperlink w:history="1" r:id="rIdkbdtxzuta0wteltciqiog">
+      <w:hyperlink w:history="1" r:id="rIdslkilut9jsu822t98khoc">
         <w:r>
           <w:rPr>
             <w:color w:val="2E75B6"/>
@@ -110,7 +110,7 @@
         </w:rPr>
         <w:t xml:space="preserve">   |   </w:t>
       </w:r>
-      <w:hyperlink w:history="1" r:id="rIddcxvb6-tkwpieuexu_nea">
+      <w:hyperlink w:history="1" r:id="rIdynxkp5awjbyyomtsqxyx0">
         <w:r>
           <w:rPr>
             <w:color w:val="2E75B6"/>
@@ -1616,7 +1616,7 @@
         </w:rPr>
         <w:t xml:space="preserve">rebuilt a Shopify storefront for a health-tech brand as a fully bilingual (Arabic + English) theme with RTL/LTR switching, localized navigation, and optimized product pages. </w:t>
       </w:r>
-      <w:hyperlink w:history="1" r:id="rIdobwh5s0vn1wm2ixxwti3e">
+      <w:hyperlink w:history="1" r:id="rIdxysvnqil_w5dfricovpyg">
         <w:r>
           <w:rPr>
             <w:color w:val="2E75B6"/>
@@ -1645,6 +1645,45 @@
           <w:sz w:val="20"/>
           <w:szCs w:val="20"/>
         </w:rPr>
+        <w:t xml:space="preserve">aloraiman.com (Al Oraiman Perfumes) — </w:t>
+      </w:r>
+      <w:r>
+        <w:rPr>
+          <w:color w:val="333333"/>
+          <w:sz w:val="20"/>
+          <w:szCs w:val="20"/>
+        </w:rPr>
+        <w:t xml:space="preserve">bilingual (AR/EN) Shopify storefront for a luxury perfumes brand. Custom theme with RTL/LTR switching plus a custom-coded multi-currency switcher integrated with a live FX-rates API. </w:t>
+      </w:r>
+      <w:hyperlink w:history="1" r:id="rIdxheabxl02zuvwrogwd1wq">
+        <w:r>
+          <w:rPr>
+            <w:color w:val="2E75B6"/>
+            <w:sz w:val="20"/>
+            <w:szCs w:val="20"/>
+            <w:u w:val="single"/>
+          </w:rPr>
+          <w:t xml:space="preserve">aloraiman.com</w:t>
+        </w:r>
+      </w:hyperlink>
+    </w:p>
+    <w:p>
+      <w:pPr>
+        <w:pStyle w:val="ListParagraph"/>
+        <w:numPr>
+          <w:ilvl w:val="0"/>
+          <w:numId w:val="2"/>
+        </w:numPr>
+        <w:spacing w:after="40"/>
+      </w:pPr>
+      <w:r>
+        <w:rPr>
+          <w:b/>
+          <w:bCs/>
+          <w:color w:val="1F3B57"/>
+          <w:sz w:val="20"/>
+          <w:szCs w:val="20"/>
+        </w:rPr>
         <w:t xml:space="preserve">thecatchofficial.com — </w:t>
       </w:r>
       <w:r>
@@ -1655,7 +1694,7 @@
         </w:rPr>
         <w:t xml:space="preserve">delivered a new Shopify store end-to-end with a custom bilingual (AR/EN) theme, checkout tweaks, and a responsive, conversion-focused UI. </w:t>
       </w:r>
-      <w:hyperlink w:history="1" r:id="rIdttyjxsm4irdotfynskykb">
+      <w:hyperlink w:history="1" r:id="rId4yihnjznklrpazm2gndbm">
         <w:r>
           <w:rPr>
             <w:color w:val="2E75B6"/>
@@ -1765,7 +1804,7 @@
         </w:rPr>
         <w:t xml:space="preserve">— Laravel 11 + Filament 3, bilingual AR/EN, Zoom + Google Calendar integration — booking platform with auto-meeting creation on confirmation. </w:t>
       </w:r>
-      <w:hyperlink w:history="1" r:id="rIdxeumjihtmsdqgkp2fzpu8">
+      <w:hyperlink w:history="1" r:id="rIdkpff1vzrxbyfysdrj8fnv">
         <w:r>
           <w:rPr>
             <w:color w:val="2E75B6"/>

</xml_diff>

<commit_message>
Remove Aloraiman, add starting prices on services
</commit_message>
<xml_diff>
--- a/Ahmed_Beshir_Resume.docx
+++ b/Ahmed_Beshir_Resume.docx
@@ -74,7 +74,7 @@
         </w:rPr>
         <w:t xml:space="preserve">   |   </w:t>
       </w:r>
-      <w:hyperlink w:history="1" r:id="rIdfjtam47srgggq5phf5wln">
+      <w:hyperlink w:history="1" r:id="rIdnkdbsfauu4ehz1_xn7i1w">
         <w:r>
           <w:rPr>
             <w:color w:val="2E75B6"/>
@@ -92,7 +92,7 @@
         </w:rPr>
         <w:t xml:space="preserve">   |   </w:t>
       </w:r>
-      <w:hyperlink w:history="1" r:id="rIdslkilut9jsu822t98khoc">
+      <w:hyperlink w:history="1" r:id="rIdl0tdgoaumvoyte6_avxjw">
         <w:r>
           <w:rPr>
             <w:color w:val="2E75B6"/>
@@ -110,7 +110,7 @@
         </w:rPr>
         <w:t xml:space="preserve">   |   </w:t>
       </w:r>
-      <w:hyperlink w:history="1" r:id="rIdynxkp5awjbyyomtsqxyx0">
+      <w:hyperlink w:history="1" r:id="rIdh5w4bahkrpwu5arpqxijh">
         <w:r>
           <w:rPr>
             <w:color w:val="2E75B6"/>
@@ -1616,7 +1616,7 @@
         </w:rPr>
         <w:t xml:space="preserve">rebuilt a Shopify storefront for a health-tech brand as a fully bilingual (Arabic + English) theme with RTL/LTR switching, localized navigation, and optimized product pages. </w:t>
       </w:r>
-      <w:hyperlink w:history="1" r:id="rIdxysvnqil_w5dfricovpyg">
+      <w:hyperlink w:history="1" r:id="rIdcimb87jbculn796fwqryg">
         <w:r>
           <w:rPr>
             <w:color w:val="2E75B6"/>
@@ -1645,45 +1645,6 @@
           <w:sz w:val="20"/>
           <w:szCs w:val="20"/>
         </w:rPr>
-        <w:t xml:space="preserve">aloraiman.com (Al Oraiman Perfumes) — </w:t>
-      </w:r>
-      <w:r>
-        <w:rPr>
-          <w:color w:val="333333"/>
-          <w:sz w:val="20"/>
-          <w:szCs w:val="20"/>
-        </w:rPr>
-        <w:t xml:space="preserve">bilingual (AR/EN) Shopify storefront for a luxury perfumes brand. Custom theme with RTL/LTR switching plus a custom-coded multi-currency switcher integrated with a live FX-rates API. </w:t>
-      </w:r>
-      <w:hyperlink w:history="1" r:id="rIdxheabxl02zuvwrogwd1wq">
-        <w:r>
-          <w:rPr>
-            <w:color w:val="2E75B6"/>
-            <w:sz w:val="20"/>
-            <w:szCs w:val="20"/>
-            <w:u w:val="single"/>
-          </w:rPr>
-          <w:t xml:space="preserve">aloraiman.com</w:t>
-        </w:r>
-      </w:hyperlink>
-    </w:p>
-    <w:p>
-      <w:pPr>
-        <w:pStyle w:val="ListParagraph"/>
-        <w:numPr>
-          <w:ilvl w:val="0"/>
-          <w:numId w:val="2"/>
-        </w:numPr>
-        <w:spacing w:after="40"/>
-      </w:pPr>
-      <w:r>
-        <w:rPr>
-          <w:b/>
-          <w:bCs/>
-          <w:color w:val="1F3B57"/>
-          <w:sz w:val="20"/>
-          <w:szCs w:val="20"/>
-        </w:rPr>
         <w:t xml:space="preserve">thecatchofficial.com — </w:t>
       </w:r>
       <w:r>
@@ -1694,7 +1655,7 @@
         </w:rPr>
         <w:t xml:space="preserve">delivered a new Shopify store end-to-end with a custom bilingual (AR/EN) theme, checkout tweaks, and a responsive, conversion-focused UI. </w:t>
       </w:r>
-      <w:hyperlink w:history="1" r:id="rId4yihnjznklrpazm2gndbm">
+      <w:hyperlink w:history="1" r:id="rIdqbz_mb1eotwnsf_9gnhz0">
         <w:r>
           <w:rPr>
             <w:color w:val="2E75B6"/>
@@ -1804,7 +1765,7 @@
         </w:rPr>
         <w:t xml:space="preserve">— Laravel 11 + Filament 3, bilingual AR/EN, Zoom + Google Calendar integration — booking platform with auto-meeting creation on confirmation. </w:t>
       </w:r>
-      <w:hyperlink w:history="1" r:id="rIdkpff1vzrxbyfysdrj8fnv">
+      <w:hyperlink w:history="1" r:id="rIdhcpu0h5qcynia1p4glie6">
         <w:r>
           <w:rPr>
             <w:color w:val="2E75B6"/>

</xml_diff>